<commit_message>
fix: corregir lógica de turnos en traza aceptada
</commit_message>
<xml_diff>
--- a/Guion_General_PDA.docx
+++ b/Guion_General_PDA.docx
@@ -430,9 +430,9 @@
         </w:rPr>
         <w:t xml:space="preserve">El atacante avanza a largo (haciendo push), y el defensor falla la parada. Volvemos a estar en q_a pero con la pila en Largo.
 El atacante avanza a Medio, pero esta vez el defensor hace una retirada (un pop), empujándolo de vuelta a Largo.
-A partir de ahí, el atacante re-avanza a Medio, a Corto, y finalmente a Corps-à-corps, acumulando todo el historial en la pila.
-El defensor vuelve a fallar la parada.
-Finalmente, el atacante ejecuta el tocado desde Corps-à-corps, lo cual es una transición válida hacia q_v. La cadena es ACEPTADA.</w:t>
+El atacante re-avanza a Medio y el defensor falla. Luego el atacante avanza a Corto y el defensor vuelve a fallar.
+Finalmente, el atacante avanza a Corps-à-corps y el defensor falla su última parada, quedando sin distancia.
+Con el turno del atacante y la pila en Corps-à-corps, ejecuta el tocado, lo cual es una transición válida hacia q_v. La cadena es ACEPTADA.</w:t>
       </w:r>
     </w:p>
     <w:p>

</xml_diff>